<commit_message>
Refine intermittency/MIHR open-work entries — FTG phase 4 covers it partly
phase4_intermittency_stress.py in ltemry/FTG-Final-Project already
addresses renewable intermittency via LMP signatures (diurnal profile,
evening-ramp premium, negative-LMP frequency) and contains a Uri-style
stress test. We have vendored OU + MC from that repo but not phase 4.
Updated the open-work bullets to (a) acknowledge the LMP-signature
coverage, (b) separate it from true MIHR-style capacity-factor derate
(still genuinely open), and (c) flag porting the Uri spike injector
into monte_carlo.simulate_paths as a concrete action item.

Co-Authored-By: Claude Opus 4.7 (1M context) <noreply@anthropic.com>
</commit_message>
<xml_diff>
--- a/Final Project Current Status Report.docx
+++ b/Final Project Current Status Report.docx
@@ -6686,7 +6686,15 @@
           <w:b/>
           <w:bCs/>
         </w:rPr>
-        <w:t xml:space="preserve">Constraints from the RFP not yet modelled</w:t>
+        <w:t xml:space="preserve">Constraints from the RFP partially covered, not yet ported into the LP</w:t>
+      </w:r>
+    </w:p>
+    <w:p>
+      <w:pPr>
+        <w:spacing w:after="120"/>
+      </w:pPr>
+      <w:r>
+        <w:t xml:space="preserve">The FTG repo (ltemry/FTG-Final-Project) contains `src/phase4_intermittency_stress.py`, which addresses intermittency and tail-risk events indirectly — by reading them out of LMP signatures rather than modelling wind/solar generation directly. We have vendored the OU calibration and MC simulator from that repo, but have not yet ported phase 4. Open items:</w:t>
       </w:r>
     </w:p>
     <w:p>
@@ -6703,10 +6711,10 @@
           <w:b/>
           <w:bCs/>
         </w:rPr>
-        <w:t xml:space="preserve">Wind-solar intermittency / MIHR</w:t>
-      </w:r>
-      <w:r>
-        <w:t xml:space="preserve"> — the RFP asks for a substantive discussion citing ERCOT data; the LP currently treats grid power as always available at LMP, with no capacity-factor reduction. Could be added either as a stochastic capacity_factor[h] or by penalizing high-LMP hours that correlate with low renewable output.</w:t>
+        <w:t xml:space="preserve">Wind-solar intermittency / MIHR (qualitative)</w:t>
+      </w:r>
+      <w:r>
+        <w:t xml:space="preserve"> — phase 4 in the FTG repo computes diurnal LMP percentile profiles, the evening-ramp premium (hour-18 − hour-14, capturing solar dropoff), and negative-LMP frequency at HB_WEST (wind-oversupply proxy). These are LMP-implied signatures of renewable variability, which is consistent with the RFP's request for a substantive discussion citing ERCOT data. Action item: include these diagnostics in the report and decide whether to also overlay them as constraints in the LP.</w:t>
       </w:r>
     </w:p>
     <w:p>
@@ -6723,10 +6731,10 @@
           <w:b/>
           <w:bCs/>
         </w:rPr>
-        <w:t xml:space="preserve">Unscheduled-outage scenarios</w:t>
-      </w:r>
-      <w:r>
-        <w:t xml:space="preserve"> — RFP prescribes specific outage contingencies. Currently not modelled; would enter as a forced reduction in g_lmp + g_toll capacity over an outage window.</w:t>
+        <w:t xml:space="preserve">Capacity-factor derate (true MIHR-style)</w:t>
+      </w:r>
+      <w:r>
+        <w:t xml:space="preserve"> — distinct from the LMP-signature view above. Our LP currently assumes capacity_factor = 1.0 (full 100 MW/site at every hour). A direct MIHR model would multiply the per-site grid cap by a stochastic capacity_factor[h] ≤ 1 driven by renewables + transmission. Not implemented; phase 4 doesn't do this either (it works on prices, not capacity).</w:t>
       </w:r>
     </w:p>
     <w:p>
@@ -6743,10 +6751,10 @@
           <w:b/>
           <w:bCs/>
         </w:rPr>
-        <w:t xml:space="preserve">Capacity factor</w:t>
-      </w:r>
-      <w:r>
-        <w:t xml:space="preserve"> — currently 1.0 uniformly. Could be derated for transmission constraints, weather, planned maintenance.</w:t>
+        <w:t xml:space="preserve">Unscheduled-outage / Uri-style stress</w:t>
+      </w:r>
+      <w:r>
+        <w:t xml:space="preserve"> — phase 4 overlays three winter-storm analogs on the MC paths (mild 72h cold snap, moderate Uri at $500–1500/MWh + $20/MMBtu gas, full Uri replay at the $9000/MWh cap + $250/MMBtu gas) and values the toll option as tail insurance. The scenarios exist; they are not currently injected into our MC paths. Action item: port the spike-injection logic into `monte_carlo.simulate_paths` (or a wrapper), then re-run Phase C — we expect the toll option's value to rise materially.</w:t>
       </w:r>
     </w:p>
     <w:p>

</xml_diff>

<commit_message>
Document stress overlay in doc + README
- Move the "Unscheduled-outage / Uri-style stress" item from "still
  open" to "ported, optional toggle" in Final Project Current Status
  Report — wind-solar/MIHR qualitative and capacity-factor derate
  remain open.
- README: add model/stress.py row to the Phase 0 table and add three
  --stress example invocations in the How-to-run section.

Co-Authored-By: Claude Opus 4.7 (1M context) <noreply@anthropic.com>
</commit_message>
<xml_diff>
--- a/Final Project Current Status Report.docx
+++ b/Final Project Current Status Report.docx
@@ -6686,7 +6686,7 @@
           <w:b/>
           <w:bCs/>
         </w:rPr>
-        <w:t xml:space="preserve">Constraints from the RFP partially covered, not yet ported into the LP</w:t>
+        <w:t xml:space="preserve">Constraints from the RFP — partially covered</w:t>
       </w:r>
     </w:p>
     <w:p>
@@ -6694,7 +6694,7 @@
         <w:spacing w:after="120"/>
       </w:pPr>
       <w:r>
-        <w:t xml:space="preserve">The FTG repo (ltemry/FTG-Final-Project) contains `src/phase4_intermittency_stress.py`, which addresses intermittency and tail-risk events indirectly — by reading them out of LMP signatures rather than modelling wind/solar generation directly. We have vendored the OU calibration and MC simulator from that repo, but have not yet ported phase 4. Open items:</w:t>
+        <w:t xml:space="preserve">The FTG repo (ltemry/FTG-Final-Project) contains `src/phase4_intermittency_stress.py`, which addresses intermittency and tail-risk events indirectly — by reading them out of LMP signatures rather than modelling wind/solar generation directly. We have vendored the OU calibration, MC simulator, AND (as of this revision) the stress-overlay logic from that repo. What's covered vs what's still open:</w:t>
       </w:r>
     </w:p>
     <w:p>
@@ -6711,10 +6711,10 @@
           <w:b/>
           <w:bCs/>
         </w:rPr>
-        <w:t xml:space="preserve">Wind-solar intermittency / MIHR (qualitative)</w:t>
-      </w:r>
-      <w:r>
-        <w:t xml:space="preserve"> — phase 4 in the FTG repo computes diurnal LMP percentile profiles, the evening-ramp premium (hour-18 − hour-14, capturing solar dropoff), and negative-LMP frequency at HB_WEST (wind-oversupply proxy). These are LMP-implied signatures of renewable variability, which is consistent with the RFP's request for a substantive discussion citing ERCOT data. Action item: include these diagnostics in the report and decide whether to also overlay them as constraints in the LP.</w:t>
+        <w:t xml:space="preserve">Unscheduled-outage / Uri-style stress (ported, optional toggle)</w:t>
+      </w:r>
+      <w:r>
+        <w:t xml:space="preserve"> — `model/stress.py` exposes four scenarios from FTG phase 4: none (default), mild (72 h, $200–400/MWh, p = 0.50), moderate (96 h, $500–1500/MWh + $20/MMBtu gas, p = 0.20), uri_full (100 h, $5000–9000/MWh + $250/MMBtu gas, p = 0.05). When `run_planning_doc.py --stress &lt;name&gt;` is set, the chosen overlay is applied to a fraction of the MC paths AFTER the OU simulation and BEFORE the LP solve, on both ERCOT hubs simultaneously (system-wide scarcity event). Default is `none`, so headline results are unchanged. Use it as a sensitivity / stress test — expectation is that the toll option's value rises materially under moderate/uri_full.</w:t>
       </w:r>
     </w:p>
     <w:p>
@@ -6731,10 +6731,10 @@
           <w:b/>
           <w:bCs/>
         </w:rPr>
-        <w:t xml:space="preserve">Capacity-factor derate (true MIHR-style)</w:t>
-      </w:r>
-      <w:r>
-        <w:t xml:space="preserve"> — distinct from the LMP-signature view above. Our LP currently assumes capacity_factor = 1.0 (full 100 MW/site at every hour). A direct MIHR model would multiply the per-site grid cap by a stochastic capacity_factor[h] ≤ 1 driven by renewables + transmission. Not implemented; phase 4 doesn't do this either (it works on prices, not capacity).</w:t>
+        <w:t xml:space="preserve">Wind-solar intermittency / MIHR (qualitative — still to report)</w:t>
+      </w:r>
+      <w:r>
+        <w:t xml:space="preserve"> — phase 4 in the FTG repo computes diurnal LMP percentile profiles, the evening-ramp premium (hour-18 − hour-14, capturing solar dropoff), and negative-LMP frequency at HB_WEST (wind-oversupply proxy). These are LMP-implied signatures of renewable variability, which is consistent with the RFP's request for a substantive discussion citing ERCOT data. Action item: include these diagnostics in the report; the analysis logic exists, it just isn't a separate module in our codebase yet.</w:t>
       </w:r>
     </w:p>
     <w:p>
@@ -6751,10 +6751,10 @@
           <w:b/>
           <w:bCs/>
         </w:rPr>
-        <w:t xml:space="preserve">Unscheduled-outage / Uri-style stress</w:t>
-      </w:r>
-      <w:r>
-        <w:t xml:space="preserve"> — phase 4 overlays three winter-storm analogs on the MC paths (mild 72h cold snap, moderate Uri at $500–1500/MWh + $20/MMBtu gas, full Uri replay at the $9000/MWh cap + $250/MMBtu gas) and values the toll option as tail insurance. The scenarios exist; they are not currently injected into our MC paths. Action item: port the spike-injection logic into `monte_carlo.simulate_paths` (or a wrapper), then re-run Phase C — we expect the toll option's value to rise materially.</w:t>
+        <w:t xml:space="preserve">Capacity-factor derate (true MIHR-style — still open)</w:t>
+      </w:r>
+      <w:r>
+        <w:t xml:space="preserve"> — distinct from the LMP-signature view above. Our LP currently assumes capacity_factor = 1.0 (full 100 MW/site at every hour). A direct MIHR model would multiply the per-site grid cap by a stochastic capacity_factor[h] ≤ 1 driven by renewables + transmission. Not implemented; phase 4 doesn't do this either (it works on prices, not capacity).</w:t>
       </w:r>
     </w:p>
     <w:p>

</xml_diff>

<commit_message>
Add consolidated run_summary.json + revert PUE to RFP-fixed
run_planning_doc.py now writes
run_summary_n{N}_{scheme}[_stress-{name}].json alongside the four
CSVs. The summary co-locates: config (incl. stress meta if active),
Phase A cadence ranking, Phase B locked-cadence cost breakdown +
profit distribution at the winning cadence, Phase C procurement
ranking, verification table, final policy headline, and pointers
to all four CSVs. One file answers "what did this run decide?"
without opening any CSVs.

PUE = 1.25 reverted to RFP-fixed in both the docx and the README.

Co-Authored-By: Claude Opus 4.7 (1M context) <noreply@anthropic.com>
</commit_message>
<xml_diff>
--- a/Final Project Current Status Report.docx
+++ b/Final Project Current Status Report.docx
@@ -6347,26 +6347,6 @@
       </w:r>
       <w:r>
         <w:t xml:space="preserve"> — currently 60 / 40. Drives the aggregate FLOPS_PER_COMPUTE_MWH; today it is collapsed into a single number. Once the split is set, we can also split the LP's `train` variable per hardware class (SXM preferred for training, PCIe biased to inference).</w:t>
-      </w:r>
-    </w:p>
-    <w:p>
-      <w:pPr>
-        <w:pStyle w:val="ListParagraph"/>
-        <w:numPr>
-          <w:ilvl w:val="0"/>
-          <w:numId w:val="2"/>
-        </w:numPr>
-        <w:spacing w:after="80"/>
-      </w:pPr>
-      <w:r>
-        <w:rPr>
-          <w:b/>
-          <w:bCs/>
-        </w:rPr>
-        <w:t xml:space="preserve">PUE</w:t>
-      </w:r>
-      <w:r>
-        <w:t xml:space="preserve"> — currently 1.25, applied uniformly. Hyperscale data centers run 1.10–1.40 depending on cooling, climate, and load factor; a Houston-vs-West Texas differential is plausible.</w:t>
       </w:r>
     </w:p>
     <w:p>

</xml_diff>